<commit_message>
Rewrite VPN proposal as a plain business letter
Co-Authored-By: Claude Sonnet 5.5 <noreply@anthropic.com>
Claude-Session: https://claude.ai/code/session_01MMJ81NuDiSQSdUBaGVeEoa
</commit_message>
<xml_diff>
--- a/Orvantia_VPN_Access_Proposal.docx
+++ b/Orvantia_VPN_Access_Proposal.docx
@@ -133,33 +133,131 @@
     </w:p>
     <w:p>
       <w:pPr>
-        <w:spacing w:before="0" w:after="60" w:line="264" w:lineRule="auto"/>
-        <w:jc w:val="center"/>
+        <w:spacing w:before="0" w:after="160" w:line="264" w:lineRule="auto"/>
+      </w:pPr>
+      <w:r>
+        <w:rPr>
+          <w:rFonts w:ascii="Calibri" w:eastAsia="Calibri" w:hAnsi="Calibri" w:cs="Calibri"/>
+          <w:color w:val="000000"/>
+          <w:sz w:val="22"/>
+          <w:szCs w:val="22"/>
+        </w:rPr>
+        <w:t xml:space="preserve">Date: 7 October 2026</w:t>
+      </w:r>
+    </w:p>
+    <w:p>
+      <w:pPr>
+        <w:spacing w:before="0" w:after="0" w:line="264" w:lineRule="auto"/>
+      </w:pPr>
+      <w:r>
+        <w:rPr>
+          <w:rFonts w:ascii="Calibri" w:eastAsia="Calibri" w:hAnsi="Calibri" w:cs="Calibri"/>
+          <w:color w:val="000000"/>
+          <w:sz w:val="22"/>
+          <w:szCs w:val="22"/>
+        </w:rPr>
+        <w:t xml:space="preserve">To,</w:t>
+      </w:r>
+    </w:p>
+    <w:p>
+      <w:pPr>
+        <w:spacing w:before="0" w:after="0" w:line="264" w:lineRule="auto"/>
+      </w:pPr>
+      <w:r>
+        <w:rPr>
+          <w:rFonts w:ascii="Calibri" w:eastAsia="Calibri" w:hAnsi="Calibri" w:cs="Calibri"/>
+          <w:color w:val="000000"/>
+          <w:sz w:val="22"/>
+          <w:szCs w:val="22"/>
+        </w:rPr>
+        <w:t xml:space="preserve">The IT / Network Team</w:t>
+      </w:r>
+    </w:p>
+    <w:p>
+      <w:pPr>
+        <w:spacing w:before="0" w:after="160" w:line="264" w:lineRule="auto"/>
+      </w:pPr>
+      <w:r>
+        <w:rPr>
+          <w:rFonts w:ascii="Calibri" w:eastAsia="Calibri" w:hAnsi="Calibri" w:cs="Calibri"/>
+          <w:color w:val="000000"/>
+          <w:sz w:val="22"/>
+          <w:szCs w:val="22"/>
+        </w:rPr>
+        <w:t xml:space="preserve">Prayagh Consumer Care Pvt. Ltd.</w:t>
+      </w:r>
+    </w:p>
+    <w:p>
+      <w:pPr>
+        <w:spacing w:before="0" w:after="160" w:line="264" w:lineRule="auto"/>
       </w:pPr>
       <w:r>
         <w:rPr>
           <w:rFonts w:ascii="Calibri" w:eastAsia="Calibri" w:hAnsi="Calibri" w:cs="Calibri"/>
           <w:b/>
-          <w:color w:val="1F3864"/>
-          <w:sz w:val="32"/>
-          <w:szCs w:val="32"/>
-        </w:rPr>
-        <w:t xml:space="preserve">VPN Access Requirement for Remote Camera Connectivity</w:t>
-      </w:r>
-    </w:p>
-    <w:p>
-      <w:pPr>
-        <w:spacing w:before="0" w:after="200" w:line="264" w:lineRule="auto"/>
-        <w:jc w:val="center"/>
-      </w:pPr>
-      <w:r>
-        <w:rPr>
-          <w:rFonts w:ascii="Calibri" w:eastAsia="Calibri" w:hAnsi="Calibri" w:cs="Calibri"/>
-          <w:color w:val="595959"/>
-          <w:sz w:val="24"/>
-          <w:szCs w:val="24"/>
-        </w:rPr>
-        <w:t xml:space="preserve">Proposal – AI-Based Attendance Tracking System</w:t>
+          <w:color w:val="000000"/>
+          <w:sz w:val="22"/>
+          <w:szCs w:val="22"/>
+        </w:rPr>
+        <w:t xml:space="preserve">Subject: Request for VPN access to the CP Plus NVR – AI-Based Attendance Tracking System</w:t>
+      </w:r>
+    </w:p>
+    <w:p>
+      <w:pPr>
+        <w:spacing w:before="0" w:after="120" w:line="264" w:lineRule="auto"/>
+      </w:pPr>
+      <w:r>
+        <w:rPr>
+          <w:rFonts w:ascii="Calibri" w:eastAsia="Calibri" w:hAnsi="Calibri" w:cs="Calibri"/>
+          <w:color w:val="000000"/>
+          <w:sz w:val="22"/>
+          <w:szCs w:val="22"/>
+        </w:rPr>
+        <w:t xml:space="preserve">Dear Sir/Madam,</w:t>
+      </w:r>
+    </w:p>
+    <w:p>
+      <w:pPr>
+        <w:spacing w:before="0" w:after="120" w:line="264" w:lineRule="auto"/>
+      </w:pPr>
+      <w:r>
+        <w:rPr>
+          <w:rFonts w:ascii="Calibri" w:eastAsia="Calibri" w:hAnsi="Calibri" w:cs="Calibri"/>
+          <w:color w:val="000000"/>
+          <w:sz w:val="22"/>
+          <w:szCs w:val="22"/>
+        </w:rPr>
+        <w:t xml:space="preserve">We are developing the AI-Based Attendance Tracking System for your factory, and for this we need to read the camera stream from the CP Plus NVR. At the moment the NVR can be reached only from your 80-series network (192.168.80.x), which means we can work on it only when we are physically connected to that network.</w:t>
+      </w:r>
+    </w:p>
+    <w:p>
+      <w:pPr>
+        <w:spacing w:before="0" w:after="120" w:line="264" w:lineRule="auto"/>
+      </w:pPr>
+      <w:r>
+        <w:rPr>
+          <w:rFonts w:ascii="Calibri" w:eastAsia="Calibri" w:hAnsi="Calibri" w:cs="Calibri"/>
+          <w:color w:val="000000"/>
+          <w:sz w:val="22"/>
+          <w:szCs w:val="22"/>
+        </w:rPr>
+        <w:t xml:space="preserve">To avoid this, we would like to request a VPN connection to the NVR through your existing Fortinet firewall. The NVR would stay on your private network and would not be exposed to the internet; our machine would connect through the encrypted VPN and reach the NVR by its private IP address.</w:t>
+      </w:r>
+    </w:p>
+    <w:p>
+      <w:pPr>
+        <w:keepNext/>
+        <w:spacing w:before="160" w:after="80" w:line="264" w:lineRule="auto"/>
+      </w:pPr>
+      <w:r>
+        <w:rPr>
+          <w:rFonts w:ascii="Calibri" w:eastAsia="Calibri" w:hAnsi="Calibri" w:cs="Calibri"/>
+          <w:b/>
+          <w:color w:val="000000"/>
+          <w:sz w:val="22"/>
+          <w:szCs w:val="22"/>
+        </w:rPr>
+        <w:t xml:space="preserve">NVR details we have</w:t>
       </w:r>
     </w:p>
     <w:tbl>
@@ -180,8 +278,8 @@
         </w:tblCellMar>
       </w:tblPr>
       <w:tblGrid>
-        <w:gridCol w:w="1800"/>
-        <w:gridCol w:w="7226"/>
+        <w:gridCol w:w="2600"/>
+        <w:gridCol w:w="6426"/>
       </w:tblGrid>
       <w:tr>
         <w:trPr>
@@ -189,7 +287,7 @@
         </w:trPr>
         <w:tc>
           <w:tcPr>
-            <w:tcW w:w="1800" w:type="dxa"/>
+            <w:tcW w:w="2600" w:type="dxa"/>
             <w:shd w:val="clear" w:color="auto" w:fill="F2F2F2"/>
             <w:vAlign w:val="center"/>
           </w:tcPr>
@@ -205,375 +303,13 @@
                 <w:sz w:val="22"/>
                 <w:szCs w:val="22"/>
               </w:rPr>
-              <w:t xml:space="preserve">To</w:t>
-            </w:r>
-          </w:p>
-        </w:tc>
-        <w:tc>
-          <w:tcPr>
-            <w:tcW w:w="7226" w:type="dxa"/>
-            <w:vAlign w:val="center"/>
-          </w:tcPr>
-          <w:p>
-            <w:pPr>
-              <w:spacing w:before="60" w:after="60"/>
-            </w:pPr>
-            <w:r>
-              <w:rPr>
-                <w:rFonts w:ascii="Calibri" w:eastAsia="Calibri" w:hAnsi="Calibri" w:cs="Calibri"/>
-                <w:color w:val="000000"/>
-                <w:sz w:val="22"/>
-                <w:szCs w:val="22"/>
-              </w:rPr>
-              <w:t xml:space="preserve">Prayagh Consumer Care Pvt. Ltd. (Attn: IT / Network Team)</w:t>
-            </w:r>
-          </w:p>
-        </w:tc>
-      </w:tr>
-      <w:tr>
-        <w:trPr>
-          <w:cantSplit/>
-        </w:trPr>
-        <w:tc>
-          <w:tcPr>
-            <w:tcW w:w="1800" w:type="dxa"/>
-            <w:shd w:val="clear" w:color="auto" w:fill="F2F2F2"/>
-            <w:vAlign w:val="center"/>
-          </w:tcPr>
-          <w:p>
-            <w:pPr>
-              <w:spacing w:before="60" w:after="60"/>
-            </w:pPr>
-            <w:r>
-              <w:rPr>
-                <w:rFonts w:ascii="Calibri" w:eastAsia="Calibri" w:hAnsi="Calibri" w:cs="Calibri"/>
-                <w:b/>
-                <w:color w:val="000000"/>
-                <w:sz w:val="22"/>
-                <w:szCs w:val="22"/>
-              </w:rPr>
-              <w:t xml:space="preserve">From</w:t>
-            </w:r>
-          </w:p>
-        </w:tc>
-        <w:tc>
-          <w:tcPr>
-            <w:tcW w:w="7226" w:type="dxa"/>
-            <w:vAlign w:val="center"/>
-          </w:tcPr>
-          <w:p>
-            <w:pPr>
-              <w:spacing w:before="60" w:after="60"/>
-            </w:pPr>
-            <w:r>
-              <w:rPr>
-                <w:rFonts w:ascii="Calibri" w:eastAsia="Calibri" w:hAnsi="Calibri" w:cs="Calibri"/>
-                <w:color w:val="000000"/>
-                <w:sz w:val="22"/>
-                <w:szCs w:val="22"/>
-              </w:rPr>
-              <w:t xml:space="preserve">Orvantia</w:t>
-            </w:r>
-          </w:p>
-        </w:tc>
-      </w:tr>
-      <w:tr>
-        <w:trPr>
-          <w:cantSplit/>
-        </w:trPr>
-        <w:tc>
-          <w:tcPr>
-            <w:tcW w:w="1800" w:type="dxa"/>
-            <w:shd w:val="clear" w:color="auto" w:fill="F2F2F2"/>
-            <w:vAlign w:val="center"/>
-          </w:tcPr>
-          <w:p>
-            <w:pPr>
-              <w:spacing w:before="60" w:after="60"/>
-            </w:pPr>
-            <w:r>
-              <w:rPr>
-                <w:rFonts w:ascii="Calibri" w:eastAsia="Calibri" w:hAnsi="Calibri" w:cs="Calibri"/>
-                <w:b/>
-                <w:color w:val="000000"/>
-                <w:sz w:val="22"/>
-                <w:szCs w:val="22"/>
-              </w:rPr>
-              <w:t xml:space="preserve">Project</w:t>
-            </w:r>
-          </w:p>
-        </w:tc>
-        <w:tc>
-          <w:tcPr>
-            <w:tcW w:w="7226" w:type="dxa"/>
-            <w:vAlign w:val="center"/>
-          </w:tcPr>
-          <w:p>
-            <w:pPr>
-              <w:spacing w:before="60" w:after="60"/>
-            </w:pPr>
-            <w:r>
-              <w:rPr>
-                <w:rFonts w:ascii="Calibri" w:eastAsia="Calibri" w:hAnsi="Calibri" w:cs="Calibri"/>
-                <w:color w:val="000000"/>
-                <w:sz w:val="22"/>
-                <w:szCs w:val="22"/>
-              </w:rPr>
-              <w:t xml:space="preserve">AI-Based Attendance Tracking System</w:t>
-            </w:r>
-          </w:p>
-        </w:tc>
-      </w:tr>
-      <w:tr>
-        <w:trPr>
-          <w:cantSplit/>
-        </w:trPr>
-        <w:tc>
-          <w:tcPr>
-            <w:tcW w:w="1800" w:type="dxa"/>
-            <w:shd w:val="clear" w:color="auto" w:fill="F2F2F2"/>
-            <w:vAlign w:val="center"/>
-          </w:tcPr>
-          <w:p>
-            <w:pPr>
-              <w:spacing w:before="60" w:after="60"/>
-            </w:pPr>
-            <w:r>
-              <w:rPr>
-                <w:rFonts w:ascii="Calibri" w:eastAsia="Calibri" w:hAnsi="Calibri" w:cs="Calibri"/>
-                <w:b/>
-                <w:color w:val="000000"/>
-                <w:sz w:val="22"/>
-                <w:szCs w:val="22"/>
-              </w:rPr>
-              <w:t xml:space="preserve">Date</w:t>
-            </w:r>
-          </w:p>
-        </w:tc>
-        <w:tc>
-          <w:tcPr>
-            <w:tcW w:w="7226" w:type="dxa"/>
-            <w:vAlign w:val="center"/>
-          </w:tcPr>
-          <w:p>
-            <w:pPr>
-              <w:spacing w:before="60" w:after="60"/>
-            </w:pPr>
-            <w:r>
-              <w:rPr>
-                <w:rFonts w:ascii="Calibri" w:eastAsia="Calibri" w:hAnsi="Calibri" w:cs="Calibri"/>
-                <w:color w:val="000000"/>
-                <w:sz w:val="22"/>
-                <w:szCs w:val="22"/>
-              </w:rPr>
-              <w:t xml:space="preserve">7 October 2026</w:t>
-            </w:r>
-          </w:p>
-        </w:tc>
-      </w:tr>
-    </w:tbl>
-    <w:p>
-      <w:pPr>
-        <w:keepNext/>
-        <w:pBdr>
-          <w:bottom w:val="single" w:sz="6" w:space="2" w:color="1F3864"/>
-        </w:pBdr>
-        <w:spacing w:before="280" w:after="120"/>
-      </w:pPr>
-      <w:r>
-        <w:rPr>
-          <w:rFonts w:ascii="Calibri" w:eastAsia="Calibri" w:hAnsi="Calibri" w:cs="Calibri"/>
-          <w:b/>
-          <w:color w:val="1F3864"/>
-          <w:sz w:val="26"/>
-          <w:szCs w:val="26"/>
-        </w:rPr>
-        <w:t xml:space="preserve">1. Objective</w:t>
-      </w:r>
-    </w:p>
-    <w:p>
-      <w:pPr>
-        <w:spacing w:before="0" w:after="120" w:line="264" w:lineRule="auto"/>
-      </w:pPr>
-      <w:r>
-        <w:rPr>
-          <w:rFonts w:ascii="Calibri" w:eastAsia="Calibri" w:hAnsi="Calibri" w:cs="Calibri"/>
-          <w:color w:val="000000"/>
-          <w:sz w:val="22"/>
-          <w:szCs w:val="22"/>
-        </w:rPr>
-        <w:t xml:space="preserve">To enable Orvantia to securely access the CP Plus camera/NVR remotely from the Orvantia machine for the development, testing, and operation of the AI-Based Attendance Tracking System.</w:t>
-      </w:r>
-    </w:p>
-    <w:p>
-      <w:pPr>
-        <w:spacing w:before="0" w:after="120" w:line="264" w:lineRule="auto"/>
-      </w:pPr>
-      <w:r>
-        <w:rPr>
-          <w:rFonts w:ascii="Calibri" w:eastAsia="Calibri" w:hAnsi="Calibri" w:cs="Calibri"/>
-          <w:color w:val="000000"/>
-          <w:sz w:val="22"/>
-          <w:szCs w:val="22"/>
-        </w:rPr>
-        <w:t xml:space="preserve">Currently, the camera/NVR is accessible only when connected to the client’s </w:t>
-      </w:r>
-      <w:r>
-        <w:rPr>
-          <w:rFonts w:ascii="Calibri" w:eastAsia="Calibri" w:hAnsi="Calibri" w:cs="Calibri"/>
-          <w:b/>
-          <w:color w:val="000000"/>
-          <w:sz w:val="22"/>
-          <w:szCs w:val="22"/>
-        </w:rPr>
-        <w:t xml:space="preserve">80-series network</w:t>
-      </w:r>
-      <w:r>
-        <w:rPr>
-          <w:rFonts w:ascii="Calibri" w:eastAsia="Calibri" w:hAnsi="Calibri" w:cs="Calibri"/>
-          <w:color w:val="000000"/>
-          <w:sz w:val="22"/>
-          <w:szCs w:val="22"/>
-        </w:rPr>
-        <w:t xml:space="preserve">. To enable remote access, we propose establishing a </w:t>
-      </w:r>
-      <w:r>
-        <w:rPr>
-          <w:rFonts w:ascii="Calibri" w:eastAsia="Calibri" w:hAnsi="Calibri" w:cs="Calibri"/>
-          <w:b/>
-          <w:color w:val="000000"/>
-          <w:sz w:val="22"/>
-          <w:szCs w:val="22"/>
-        </w:rPr>
-        <w:t xml:space="preserve">VPN connection through the client’s Fortinet firewall</w:t>
-      </w:r>
-      <w:r>
-        <w:rPr>
-          <w:rFonts w:ascii="Calibri" w:eastAsia="Calibri" w:hAnsi="Calibri" w:cs="Calibri"/>
-          <w:color w:val="000000"/>
-          <w:sz w:val="22"/>
-          <w:szCs w:val="22"/>
-        </w:rPr>
-        <w:t xml:space="preserve">.</w:t>
-      </w:r>
-    </w:p>
-    <w:p>
-      <w:pPr>
-        <w:keepNext/>
-        <w:pBdr>
-          <w:bottom w:val="single" w:sz="6" w:space="2" w:color="1F3864"/>
-        </w:pBdr>
-        <w:spacing w:before="280" w:after="120"/>
-      </w:pPr>
-      <w:r>
-        <w:rPr>
-          <w:rFonts w:ascii="Calibri" w:eastAsia="Calibri" w:hAnsi="Calibri" w:cs="Calibri"/>
-          <w:b/>
-          <w:color w:val="1F3864"/>
-          <w:sz w:val="26"/>
-          <w:szCs w:val="26"/>
-        </w:rPr>
-        <w:t xml:space="preserve">2. Current Camera Configuration</w:t>
-      </w:r>
-    </w:p>
-    <w:tbl>
-      <w:tblPr>
-        <w:tblW w:w="9026" w:type="dxa"/>
-        <w:tblBorders>
-          <w:top w:val="single" w:sz="4" w:space="0" w:color="A6A6A6"/>
-          <w:left w:val="single" w:sz="4" w:space="0" w:color="A6A6A6"/>
-          <w:bottom w:val="single" w:sz="4" w:space="0" w:color="A6A6A6"/>
-          <w:right w:val="single" w:sz="4" w:space="0" w:color="A6A6A6"/>
-          <w:insideH w:val="single" w:sz="4" w:space="0" w:color="A6A6A6"/>
-          <w:insideV w:val="single" w:sz="4" w:space="0" w:color="A6A6A6"/>
-        </w:tblBorders>
-        <w:tblLayout w:type="fixed"/>
-        <w:tblCellMar>
-          <w:left w:w="120" w:type="dxa"/>
-          <w:right w:w="120" w:type="dxa"/>
-        </w:tblCellMar>
-      </w:tblPr>
-      <w:tblGrid>
-        <w:gridCol w:w="3000"/>
-        <w:gridCol w:w="6026"/>
-      </w:tblGrid>
-      <w:tr>
-        <w:trPr>
-          <w:cantSplit/>
-          <w:tblHeader/>
-        </w:trPr>
-        <w:tc>
-          <w:tcPr>
-            <w:tcW w:w="3000" w:type="dxa"/>
-            <w:shd w:val="clear" w:color="auto" w:fill="DCE6F2"/>
-            <w:vAlign w:val="center"/>
-          </w:tcPr>
-          <w:p>
-            <w:pPr>
-              <w:spacing w:before="60" w:after="60"/>
-            </w:pPr>
-            <w:r>
-              <w:rPr>
-                <w:rFonts w:ascii="Calibri" w:eastAsia="Calibri" w:hAnsi="Calibri" w:cs="Calibri"/>
-                <w:b/>
-                <w:color w:val="000000"/>
-                <w:sz w:val="22"/>
-                <w:szCs w:val="22"/>
-              </w:rPr>
-              <w:t xml:space="preserve">Parameter</w:t>
-            </w:r>
-          </w:p>
-        </w:tc>
-        <w:tc>
-          <w:tcPr>
-            <w:tcW w:w="6026" w:type="dxa"/>
-            <w:shd w:val="clear" w:color="auto" w:fill="DCE6F2"/>
-            <w:vAlign w:val="center"/>
-          </w:tcPr>
-          <w:p>
-            <w:pPr>
-              <w:spacing w:before="60" w:after="60"/>
-            </w:pPr>
-            <w:r>
-              <w:rPr>
-                <w:rFonts w:ascii="Calibri" w:eastAsia="Calibri" w:hAnsi="Calibri" w:cs="Calibri"/>
-                <w:b/>
-                <w:color w:val="000000"/>
-                <w:sz w:val="22"/>
-                <w:szCs w:val="22"/>
-              </w:rPr>
-              <w:t xml:space="preserve">Details</w:t>
-            </w:r>
-          </w:p>
-        </w:tc>
-      </w:tr>
-      <w:tr>
-        <w:trPr>
-          <w:cantSplit/>
-        </w:trPr>
-        <w:tc>
-          <w:tcPr>
-            <w:tcW w:w="3000" w:type="dxa"/>
-            <w:vAlign w:val="center"/>
-          </w:tcPr>
-          <w:p>
-            <w:pPr>
-              <w:spacing w:before="60" w:after="60"/>
-            </w:pPr>
-            <w:r>
-              <w:rPr>
-                <w:rFonts w:ascii="Calibri" w:eastAsia="Calibri" w:hAnsi="Calibri" w:cs="Calibri"/>
-                <w:color w:val="000000"/>
-                <w:sz w:val="22"/>
-                <w:szCs w:val="22"/>
-              </w:rPr>
               <w:t xml:space="preserve">Device</w:t>
             </w:r>
           </w:p>
         </w:tc>
         <w:tc>
           <w:tcPr>
-            <w:tcW w:w="6026" w:type="dxa"/>
+            <w:tcW w:w="6426" w:type="dxa"/>
             <w:vAlign w:val="center"/>
           </w:tcPr>
           <w:p>
@@ -598,7 +334,8 @@
         </w:trPr>
         <w:tc>
           <w:tcPr>
-            <w:tcW w:w="3000" w:type="dxa"/>
+            <w:tcW w:w="2600" w:type="dxa"/>
+            <w:shd w:val="clear" w:color="auto" w:fill="F2F2F2"/>
             <w:vAlign w:val="center"/>
           </w:tcPr>
           <w:p>
@@ -608,17 +345,18 @@
             <w:r>
               <w:rPr>
                 <w:rFonts w:ascii="Calibri" w:eastAsia="Calibri" w:hAnsi="Calibri" w:cs="Calibri"/>
+                <w:b/>
                 <w:color w:val="000000"/>
                 <w:sz w:val="22"/>
                 <w:szCs w:val="22"/>
               </w:rPr>
-              <w:t xml:space="preserve">IP Address</w:t>
+              <w:t xml:space="preserve">IP address</w:t>
             </w:r>
           </w:p>
         </w:tc>
         <w:tc>
           <w:tcPr>
-            <w:tcW w:w="6026" w:type="dxa"/>
+            <w:tcW w:w="6426" w:type="dxa"/>
             <w:vAlign w:val="center"/>
           </w:tcPr>
           <w:p>
@@ -643,7 +381,8 @@
         </w:trPr>
         <w:tc>
           <w:tcPr>
-            <w:tcW w:w="3000" w:type="dxa"/>
+            <w:tcW w:w="2600" w:type="dxa"/>
+            <w:shd w:val="clear" w:color="auto" w:fill="F2F2F2"/>
             <w:vAlign w:val="center"/>
           </w:tcPr>
           <w:p>
@@ -653,17 +392,18 @@
             <w:r>
               <w:rPr>
                 <w:rFonts w:ascii="Calibri" w:eastAsia="Calibri" w:hAnsi="Calibri" w:cs="Calibri"/>
+                <w:b/>
                 <w:color w:val="000000"/>
                 <w:sz w:val="22"/>
                 <w:szCs w:val="22"/>
               </w:rPr>
-              <w:t xml:space="preserve">Subnet Mask</w:t>
+              <w:t xml:space="preserve">Subnet mask</w:t>
             </w:r>
           </w:p>
         </w:tc>
         <w:tc>
           <w:tcPr>
-            <w:tcW w:w="6026" w:type="dxa"/>
+            <w:tcW w:w="6426" w:type="dxa"/>
             <w:vAlign w:val="center"/>
           </w:tcPr>
           <w:p>
@@ -688,7 +428,8 @@
         </w:trPr>
         <w:tc>
           <w:tcPr>
-            <w:tcW w:w="3000" w:type="dxa"/>
+            <w:tcW w:w="2600" w:type="dxa"/>
+            <w:shd w:val="clear" w:color="auto" w:fill="F2F2F2"/>
             <w:vAlign w:val="center"/>
           </w:tcPr>
           <w:p>
@@ -698,6 +439,7 @@
             <w:r>
               <w:rPr>
                 <w:rFonts w:ascii="Calibri" w:eastAsia="Calibri" w:hAnsi="Calibri" w:cs="Calibri"/>
+                <w:b/>
                 <w:color w:val="000000"/>
                 <w:sz w:val="22"/>
                 <w:szCs w:val="22"/>
@@ -708,7 +450,7 @@
         </w:tc>
         <w:tc>
           <w:tcPr>
-            <w:tcW w:w="6026" w:type="dxa"/>
+            <w:tcW w:w="6426" w:type="dxa"/>
             <w:vAlign w:val="center"/>
           </w:tcPr>
           <w:p>
@@ -733,7 +475,8 @@
         </w:trPr>
         <w:tc>
           <w:tcPr>
-            <w:tcW w:w="3000" w:type="dxa"/>
+            <w:tcW w:w="2600" w:type="dxa"/>
+            <w:shd w:val="clear" w:color="auto" w:fill="F2F2F2"/>
             <w:vAlign w:val="center"/>
           </w:tcPr>
           <w:p>
@@ -743,17 +486,18 @@
             <w:r>
               <w:rPr>
                 <w:rFonts w:ascii="Calibri" w:eastAsia="Calibri" w:hAnsi="Calibri" w:cs="Calibri"/>
+                <w:b/>
                 <w:color w:val="000000"/>
                 <w:sz w:val="22"/>
                 <w:szCs w:val="22"/>
               </w:rPr>
-              <w:t xml:space="preserve">MAC Address</w:t>
+              <w:t xml:space="preserve">MAC address</w:t>
             </w:r>
           </w:p>
         </w:tc>
         <w:tc>
           <w:tcPr>
-            <w:tcW w:w="6026" w:type="dxa"/>
+            <w:tcW w:w="6426" w:type="dxa"/>
             <w:vAlign w:val="center"/>
           </w:tcPr>
           <w:p>
@@ -778,7 +522,29 @@
         </w:trPr>
         <w:tc>
           <w:tcPr>
-            <w:tcW w:w="3000" w:type="dxa"/>
+            <w:tcW w:w="2600" w:type="dxa"/>
+            <w:shd w:val="clear" w:color="auto" w:fill="F2F2F2"/>
+            <w:vAlign w:val="center"/>
+          </w:tcPr>
+          <w:p>
+            <w:pPr>
+              <w:spacing w:before="60" w:after="60"/>
+            </w:pPr>
+            <w:r>
+              <w:rPr>
+                <w:rFonts w:ascii="Calibri" w:eastAsia="Calibri" w:hAnsi="Calibri" w:cs="Calibri"/>
+                <w:b/>
+                <w:color w:val="000000"/>
+                <w:sz w:val="22"/>
+                <w:szCs w:val="22"/>
+              </w:rPr>
+              <w:t xml:space="preserve">RTSP port</w:t>
+            </w:r>
+          </w:p>
+        </w:tc>
+        <w:tc>
+          <w:tcPr>
+            <w:tcW w:w="6426" w:type="dxa"/>
             <w:vAlign w:val="center"/>
           </w:tcPr>
           <w:p>
@@ -792,27 +558,7 @@
                 <w:sz w:val="22"/>
                 <w:szCs w:val="22"/>
               </w:rPr>
-              <w:t xml:space="preserve">RTSP Port</w:t>
-            </w:r>
-          </w:p>
-        </w:tc>
-        <w:tc>
-          <w:tcPr>
-            <w:tcW w:w="6026" w:type="dxa"/>
-            <w:vAlign w:val="center"/>
-          </w:tcPr>
-          <w:p>
-            <w:pPr>
-              <w:spacing w:before="60" w:after="60"/>
-            </w:pPr>
-            <w:r>
-              <w:rPr>
-                <w:rFonts w:ascii="Calibri" w:eastAsia="Calibri" w:hAnsi="Calibri" w:cs="Calibri"/>
-                <w:color w:val="000000"/>
-                <w:sz w:val="22"/>
-                <w:szCs w:val="22"/>
-              </w:rPr>
-              <w:t xml:space="preserve">554*</w:t>
+              <w:t xml:space="preserve">554 (to be confirmed during setup)</w:t>
             </w:r>
           </w:p>
         </w:tc>
@@ -820,344 +566,18 @@
     </w:tbl>
     <w:p>
       <w:pPr>
-        <w:spacing w:before="60" w:after="120" w:line="264" w:lineRule="auto"/>
-      </w:pPr>
-      <w:r>
-        <w:rPr>
-          <w:rFonts w:ascii="Calibri" w:eastAsia="Calibri" w:hAnsi="Calibri" w:cs="Calibri"/>
-          <w:i/>
-          <w:color w:val="595959"/>
-          <w:sz w:val="18"/>
-          <w:szCs w:val="18"/>
-        </w:rPr>
-        <w:t xml:space="preserve">*To be verified during implementation.</w:t>
-      </w:r>
-    </w:p>
-    <w:p>
-      <w:pPr>
         <w:keepNext/>
-        <w:pBdr>
-          <w:bottom w:val="single" w:sz="6" w:space="2" w:color="1F3864"/>
-        </w:pBdr>
-        <w:spacing w:before="280" w:after="120"/>
+        <w:spacing w:before="160" w:after="80" w:line="264" w:lineRule="auto"/>
       </w:pPr>
       <w:r>
         <w:rPr>
           <w:rFonts w:ascii="Calibri" w:eastAsia="Calibri" w:hAnsi="Calibri" w:cs="Calibri"/>
           <w:b/>
-          <w:color w:val="1F3864"/>
-          <w:sz w:val="26"/>
-          <w:szCs w:val="26"/>
-        </w:rPr>
-        <w:t xml:space="preserve">3. Proposed Connectivity</w:t>
-      </w:r>
-    </w:p>
-    <w:p>
-      <w:pPr>
-        <w:keepNext/>
-        <w:shd w:val="clear" w:color="auto" w:fill="F2F2F2"/>
-        <w:spacing w:after="0" w:line="240" w:lineRule="auto"/>
-        <w:ind w:left="567"/>
-      </w:pPr>
-      <w:r>
-        <w:rPr>
-          <w:rFonts w:ascii="Consolas" w:hAnsi="Consolas" w:cs="Consolas"/>
-          <w:color w:val="000000"/>
-          <w:sz w:val="19"/>
-          <w:szCs w:val="19"/>
-        </w:rPr>
-        <w:t xml:space="preserve">CP Plus NVR</w:t>
-      </w:r>
-    </w:p>
-    <w:p>
-      <w:pPr>
-        <w:keepNext/>
-        <w:shd w:val="clear" w:color="auto" w:fill="F2F2F2"/>
-        <w:spacing w:after="0" w:line="240" w:lineRule="auto"/>
-        <w:ind w:left="567"/>
-      </w:pPr>
-      <w:r>
-        <w:rPr>
-          <w:rFonts w:ascii="Consolas" w:hAnsi="Consolas" w:cs="Consolas"/>
-          <w:color w:val="000000"/>
-          <w:sz w:val="19"/>
-          <w:szCs w:val="19"/>
-        </w:rPr>
-        <w:t xml:space="preserve">192.168.80.30</w:t>
-      </w:r>
-    </w:p>
-    <w:p>
-      <w:pPr>
-        <w:keepNext/>
-        <w:shd w:val="clear" w:color="auto" w:fill="F2F2F2"/>
-        <w:spacing w:after="0" w:line="240" w:lineRule="auto"/>
-        <w:ind w:left="567"/>
-      </w:pPr>
-      <w:r>
-        <w:rPr>
-          <w:rFonts w:ascii="Consolas" w:hAnsi="Consolas" w:cs="Consolas"/>
-          <w:color w:val="000000"/>
-          <w:sz w:val="19"/>
-          <w:szCs w:val="19"/>
-        </w:rPr>
-        <w:t xml:space="preserve">      |</w:t>
-      </w:r>
-    </w:p>
-    <w:p>
-      <w:pPr>
-        <w:keepNext/>
-        <w:shd w:val="clear" w:color="auto" w:fill="F2F2F2"/>
-        <w:spacing w:after="0" w:line="240" w:lineRule="auto"/>
-        <w:ind w:left="567"/>
-      </w:pPr>
-      <w:r>
-        <w:rPr>
-          <w:rFonts w:ascii="Consolas" w:hAnsi="Consolas" w:cs="Consolas"/>
-          <w:color w:val="000000"/>
-          <w:sz w:val="19"/>
-          <w:szCs w:val="19"/>
-        </w:rPr>
-        <w:t xml:space="preserve">Factory Network</w:t>
-      </w:r>
-    </w:p>
-    <w:p>
-      <w:pPr>
-        <w:keepNext/>
-        <w:shd w:val="clear" w:color="auto" w:fill="F2F2F2"/>
-        <w:spacing w:after="0" w:line="240" w:lineRule="auto"/>
-        <w:ind w:left="567"/>
-      </w:pPr>
-      <w:r>
-        <w:rPr>
-          <w:rFonts w:ascii="Consolas" w:hAnsi="Consolas" w:cs="Consolas"/>
-          <w:color w:val="000000"/>
-          <w:sz w:val="19"/>
-          <w:szCs w:val="19"/>
-        </w:rPr>
-        <w:t xml:space="preserve">      |</w:t>
-      </w:r>
-    </w:p>
-    <w:p>
-      <w:pPr>
-        <w:keepNext/>
-        <w:shd w:val="clear" w:color="auto" w:fill="F2F2F2"/>
-        <w:spacing w:after="0" w:line="240" w:lineRule="auto"/>
-        <w:ind w:left="567"/>
-      </w:pPr>
-      <w:r>
-        <w:rPr>
-          <w:rFonts w:ascii="Consolas" w:hAnsi="Consolas" w:cs="Consolas"/>
-          <w:color w:val="000000"/>
-          <w:sz w:val="19"/>
-          <w:szCs w:val="19"/>
-        </w:rPr>
-        <w:t xml:space="preserve">      v</w:t>
-      </w:r>
-    </w:p>
-    <w:p>
-      <w:pPr>
-        <w:keepNext/>
-        <w:shd w:val="clear" w:color="auto" w:fill="F2F2F2"/>
-        <w:spacing w:after="0" w:line="240" w:lineRule="auto"/>
-        <w:ind w:left="567"/>
-      </w:pPr>
-      <w:r>
-        <w:rPr>
-          <w:rFonts w:ascii="Consolas" w:hAnsi="Consolas" w:cs="Consolas"/>
-          <w:color w:val="000000"/>
-          <w:sz w:val="19"/>
-          <w:szCs w:val="19"/>
-        </w:rPr>
-        <w:t xml:space="preserve">Fortinet Firewall</w:t>
-      </w:r>
-    </w:p>
-    <w:p>
-      <w:pPr>
-        <w:keepNext/>
-        <w:shd w:val="clear" w:color="auto" w:fill="F2F2F2"/>
-        <w:spacing w:after="0" w:line="240" w:lineRule="auto"/>
-        <w:ind w:left="567"/>
-      </w:pPr>
-      <w:r>
-        <w:rPr>
-          <w:rFonts w:ascii="Consolas" w:hAnsi="Consolas" w:cs="Consolas"/>
-          <w:color w:val="000000"/>
-          <w:sz w:val="19"/>
-          <w:szCs w:val="19"/>
-        </w:rPr>
-        <w:t xml:space="preserve">192.168.80.1</w:t>
-      </w:r>
-    </w:p>
-    <w:p>
-      <w:pPr>
-        <w:keepNext/>
-        <w:shd w:val="clear" w:color="auto" w:fill="F2F2F2"/>
-        <w:spacing w:after="0" w:line="240" w:lineRule="auto"/>
-        <w:ind w:left="567"/>
-      </w:pPr>
-      <w:r>
-        <w:rPr>
-          <w:rFonts w:ascii="Consolas" w:hAnsi="Consolas" w:cs="Consolas"/>
-          <w:color w:val="000000"/>
-          <w:sz w:val="19"/>
-          <w:szCs w:val="19"/>
-        </w:rPr>
-        <w:t xml:space="preserve">      |</w:t>
-      </w:r>
-    </w:p>
-    <w:p>
-      <w:pPr>
-        <w:keepNext/>
-        <w:shd w:val="clear" w:color="auto" w:fill="F2F2F2"/>
-        <w:spacing w:after="0" w:line="240" w:lineRule="auto"/>
-        <w:ind w:left="567"/>
-      </w:pPr>
-      <w:r>
-        <w:rPr>
-          <w:rFonts w:ascii="Consolas" w:hAnsi="Consolas" w:cs="Consolas"/>
-          <w:color w:val="000000"/>
-          <w:sz w:val="19"/>
-          <w:szCs w:val="19"/>
-        </w:rPr>
-        <w:t xml:space="preserve">      |  Encrypted VPN</w:t>
-      </w:r>
-    </w:p>
-    <w:p>
-      <w:pPr>
-        <w:keepNext/>
-        <w:shd w:val="clear" w:color="auto" w:fill="F2F2F2"/>
-        <w:spacing w:after="0" w:line="240" w:lineRule="auto"/>
-        <w:ind w:left="567"/>
-      </w:pPr>
-      <w:r>
-        <w:rPr>
-          <w:rFonts w:ascii="Consolas" w:hAnsi="Consolas" w:cs="Consolas"/>
-          <w:color w:val="000000"/>
-          <w:sz w:val="19"/>
-          <w:szCs w:val="19"/>
-        </w:rPr>
-        <w:t xml:space="preserve">      v</w:t>
-      </w:r>
-    </w:p>
-    <w:p>
-      <w:pPr>
-        <w:keepNext/>
-        <w:shd w:val="clear" w:color="auto" w:fill="F2F2F2"/>
-        <w:spacing w:after="0" w:line="240" w:lineRule="auto"/>
-        <w:ind w:left="567"/>
-      </w:pPr>
-      <w:r>
-        <w:rPr>
-          <w:rFonts w:ascii="Consolas" w:hAnsi="Consolas" w:cs="Consolas"/>
-          <w:color w:val="000000"/>
-          <w:sz w:val="19"/>
-          <w:szCs w:val="19"/>
-        </w:rPr>
-        <w:t xml:space="preserve">Internet</w:t>
-      </w:r>
-    </w:p>
-    <w:p>
-      <w:pPr>
-        <w:keepNext/>
-        <w:shd w:val="clear" w:color="auto" w:fill="F2F2F2"/>
-        <w:spacing w:after="0" w:line="240" w:lineRule="auto"/>
-        <w:ind w:left="567"/>
-      </w:pPr>
-      <w:r>
-        <w:rPr>
-          <w:rFonts w:ascii="Consolas" w:hAnsi="Consolas" w:cs="Consolas"/>
-          <w:color w:val="000000"/>
-          <w:sz w:val="19"/>
-          <w:szCs w:val="19"/>
-        </w:rPr>
-        <w:t xml:space="preserve">      |</w:t>
-      </w:r>
-    </w:p>
-    <w:p>
-      <w:pPr>
-        <w:keepNext/>
-        <w:shd w:val="clear" w:color="auto" w:fill="F2F2F2"/>
-        <w:spacing w:after="0" w:line="240" w:lineRule="auto"/>
-        <w:ind w:left="567"/>
-      </w:pPr>
-      <w:r>
-        <w:rPr>
-          <w:rFonts w:ascii="Consolas" w:hAnsi="Consolas" w:cs="Consolas"/>
-          <w:color w:val="000000"/>
-          <w:sz w:val="19"/>
-          <w:szCs w:val="19"/>
-        </w:rPr>
-        <w:t xml:space="preserve">      v</w:t>
-      </w:r>
-    </w:p>
-    <w:p>
-      <w:pPr>
-        <w:keepNext/>
-        <w:shd w:val="clear" w:color="auto" w:fill="F2F2F2"/>
-        <w:spacing w:after="0" w:line="240" w:lineRule="auto"/>
-        <w:ind w:left="567"/>
-      </w:pPr>
-      <w:r>
-        <w:rPr>
-          <w:rFonts w:ascii="Consolas" w:hAnsi="Consolas" w:cs="Consolas"/>
-          <w:color w:val="000000"/>
-          <w:sz w:val="19"/>
-          <w:szCs w:val="19"/>
-        </w:rPr>
-        <w:t xml:space="preserve">Orvantia Remote Machine</w:t>
-      </w:r>
-    </w:p>
-    <w:p>
-      <w:pPr>
-        <w:spacing w:after="60"/>
-      </w:pPr>
-    </w:p>
-    <w:p>
-      <w:pPr>
-        <w:spacing w:before="0" w:after="120" w:line="264" w:lineRule="auto"/>
-      </w:pPr>
-      <w:r>
-        <w:rPr>
-          <w:rFonts w:ascii="Calibri" w:eastAsia="Calibri" w:hAnsi="Calibri" w:cs="Calibri"/>
-          <w:color w:val="000000"/>
-          <w:sz w:val="22"/>
-          <w:szCs w:val="22"/>
-        </w:rPr>
-        <w:t xml:space="preserve">Through the VPN, the Orvantia remote machine will securely access the NVR using its private IP address, without exposing the camera/NVR directly to the public internet.</w:t>
-      </w:r>
-    </w:p>
-    <w:p>
-      <w:pPr>
-        <w:keepNext/>
-        <w:pBdr>
-          <w:bottom w:val="single" w:sz="6" w:space="2" w:color="1F3864"/>
-        </w:pBdr>
-        <w:spacing w:before="280" w:after="120"/>
-      </w:pPr>
-      <w:r>
-        <w:rPr>
-          <w:rFonts w:ascii="Calibri" w:eastAsia="Calibri" w:hAnsi="Calibri" w:cs="Calibri"/>
-          <w:b/>
-          <w:color w:val="1F3864"/>
-          <w:sz w:val="26"/>
-          <w:szCs w:val="26"/>
-        </w:rPr>
-        <w:t xml:space="preserve">4. Required from Client IT Team</w:t>
-      </w:r>
-    </w:p>
-    <w:p>
-      <w:pPr>
-        <w:keepNext/>
-        <w:spacing w:before="0" w:after="120" w:line="264" w:lineRule="auto"/>
-      </w:pPr>
-      <w:r>
-        <w:rPr>
-          <w:rFonts w:ascii="Calibri" w:eastAsia="Calibri" w:hAnsi="Calibri" w:cs="Calibri"/>
-          <w:color w:val="000000"/>
-          <w:sz w:val="22"/>
-          <w:szCs w:val="22"/>
-        </w:rPr>
-        <w:t xml:space="preserve">The client’s IT/network team is requested to:</w:t>
+          <w:color w:val="000000"/>
+          <w:sz w:val="22"/>
+          <w:szCs w:val="22"/>
+        </w:rPr>
+        <w:t xml:space="preserve">What we need from your IT team</w:t>
       </w:r>
     </w:p>
     <w:p>
@@ -1175,7 +595,7 @@
           <w:sz w:val="22"/>
           <w:szCs w:val="22"/>
         </w:rPr>
-        <w:t xml:space="preserve">Configure a suitable remote-access VPN on the existing Fortinet firewall.</w:t>
+        <w:t xml:space="preserve">Set up a remote-access VPN on the Fortinet firewall, if one is not already available.</w:t>
       </w:r>
     </w:p>
     <w:p>
@@ -1193,7 +613,7 @@
           <w:sz w:val="22"/>
           <w:szCs w:val="22"/>
         </w:rPr>
-        <w:t xml:space="preserve">Create an authorized VPN account/configuration for Orvantia.</w:t>
+        <w:t xml:space="preserve">Create a VPN account for Orvantia and send us the connection details through a secure channel.</w:t>
       </w:r>
     </w:p>
     <w:p>
@@ -1211,26 +631,7 @@
           <w:sz w:val="22"/>
           <w:szCs w:val="22"/>
         </w:rPr>
-        <w:t xml:space="preserve">Configure the required routing between the VPN and the </w:t>
-      </w:r>
-      <w:r>
-        <w:rPr>
-          <w:rFonts w:ascii="Calibri" w:eastAsia="Calibri" w:hAnsi="Calibri" w:cs="Calibri"/>
-          <w:b/>
-          <w:color w:val="000000"/>
-          <w:sz w:val="22"/>
-          <w:szCs w:val="22"/>
-        </w:rPr>
-        <w:t xml:space="preserve">192.168.80.0/24</w:t>
-      </w:r>
-      <w:r>
-        <w:rPr>
-          <w:rFonts w:ascii="Calibri" w:eastAsia="Calibri" w:hAnsi="Calibri" w:cs="Calibri"/>
-          <w:color w:val="000000"/>
-          <w:sz w:val="22"/>
-          <w:szCs w:val="22"/>
-        </w:rPr>
-        <w:t xml:space="preserve"> network.</w:t>
+        <w:t xml:space="preserve">Allow routing between the VPN and the 192.168.80.0/24 network.</w:t>
       </w:r>
     </w:p>
     <w:p>
@@ -1248,26 +649,7 @@
           <w:sz w:val="22"/>
           <w:szCs w:val="22"/>
         </w:rPr>
-        <w:t xml:space="preserve">Allow the VPN user/system to access the NVR at </w:t>
-      </w:r>
-      <w:r>
-        <w:rPr>
-          <w:rFonts w:ascii="Calibri" w:eastAsia="Calibri" w:hAnsi="Calibri" w:cs="Calibri"/>
-          <w:b/>
-          <w:color w:val="000000"/>
-          <w:sz w:val="22"/>
-          <w:szCs w:val="22"/>
-        </w:rPr>
-        <w:t xml:space="preserve">192.168.80.30</w:t>
-      </w:r>
-      <w:r>
-        <w:rPr>
-          <w:rFonts w:ascii="Calibri" w:eastAsia="Calibri" w:hAnsi="Calibri" w:cs="Calibri"/>
-          <w:color w:val="000000"/>
-          <w:sz w:val="22"/>
-          <w:szCs w:val="22"/>
-        </w:rPr>
-        <w:t xml:space="preserve">.</w:t>
+        <w:t xml:space="preserve">Allow our VPN user to reach the NVR at 192.168.80.30 on TCP port 554 (RTSP).</w:t>
       </w:r>
     </w:p>
     <w:p>
@@ -1285,8 +667,28 @@
           <w:sz w:val="22"/>
           <w:szCs w:val="22"/>
         </w:rPr>
-        <w:t xml:space="preserve">Allow the required RTSP service, expected on </w:t>
-      </w:r>
+        <w:t xml:space="preserve">Help us test the connection once it is set up.</w:t>
+      </w:r>
+    </w:p>
+    <w:p>
+      <w:pPr>
+        <w:spacing w:before="80" w:after="120" w:line="264" w:lineRule="auto"/>
+      </w:pPr>
+      <w:r>
+        <w:rPr>
+          <w:rFonts w:ascii="Calibri" w:eastAsia="Calibri" w:hAnsi="Calibri" w:cs="Calibri"/>
+          <w:color w:val="000000"/>
+          <w:sz w:val="22"/>
+          <w:szCs w:val="22"/>
+        </w:rPr>
+        <w:t xml:space="preserve">If possible, please limit the access to the NVR and the RTSP port only, instead of opening the whole factory network to us.</w:t>
+      </w:r>
+    </w:p>
+    <w:p>
+      <w:pPr>
+        <w:keepNext/>
+        <w:spacing w:before="160" w:after="80" w:line="264" w:lineRule="auto"/>
+      </w:pPr>
       <w:r>
         <w:rPr>
           <w:rFonts w:ascii="Calibri" w:eastAsia="Calibri" w:hAnsi="Calibri" w:cs="Calibri"/>
@@ -1295,330 +697,78 @@
           <w:sz w:val="22"/>
           <w:szCs w:val="22"/>
         </w:rPr>
-        <w:t xml:space="preserve">TCP port 554</w:t>
-      </w:r>
-      <w:r>
-        <w:rPr>
-          <w:rFonts w:ascii="Calibri" w:eastAsia="Calibri" w:hAnsi="Calibri" w:cs="Calibri"/>
-          <w:color w:val="000000"/>
-          <w:sz w:val="22"/>
-          <w:szCs w:val="22"/>
-        </w:rPr>
-        <w:t xml:space="preserve">.</w:t>
-      </w:r>
-    </w:p>
-    <w:p>
-      <w:pPr>
-        <w:numPr>
-          <w:ilvl w:val="0"/>
-          <w:numId w:val="12"/>
-        </w:numPr>
-        <w:spacing w:after="80" w:line="264" w:lineRule="auto"/>
-      </w:pPr>
-      <w:r>
-        <w:rPr>
-          <w:rFonts w:ascii="Calibri" w:eastAsia="Calibri" w:hAnsi="Calibri" w:cs="Calibri"/>
-          <w:color w:val="000000"/>
-          <w:sz w:val="22"/>
-          <w:szCs w:val="22"/>
-        </w:rPr>
-        <w:t xml:space="preserve">Provide the VPN connection details securely to Orvantia.</w:t>
-      </w:r>
-    </w:p>
-    <w:p>
-      <w:pPr>
-        <w:numPr>
-          <w:ilvl w:val="0"/>
-          <w:numId w:val="12"/>
-        </w:numPr>
-        <w:spacing w:after="80" w:line="264" w:lineRule="auto"/>
-      </w:pPr>
-      <w:r>
-        <w:rPr>
-          <w:rFonts w:ascii="Calibri" w:eastAsia="Calibri" w:hAnsi="Calibri" w:cs="Calibri"/>
-          <w:color w:val="000000"/>
-          <w:sz w:val="22"/>
-          <w:szCs w:val="22"/>
-        </w:rPr>
-        <w:t xml:space="preserve">Assist with connectivity testing from the Orvantia remote machine.</w:t>
-      </w:r>
-    </w:p>
-    <w:p>
-      <w:pPr>
-        <w:spacing w:before="80" w:after="120" w:line="264" w:lineRule="auto"/>
-      </w:pPr>
-      <w:r>
-        <w:rPr>
-          <w:rFonts w:ascii="Calibri" w:eastAsia="Calibri" w:hAnsi="Calibri" w:cs="Calibri"/>
-          <w:color w:val="000000"/>
-          <w:sz w:val="22"/>
-          <w:szCs w:val="22"/>
-        </w:rPr>
-        <w:t xml:space="preserve">Access should preferably be restricted to the required NVR and services rather than providing unrestricted access to the factory network.</w:t>
-      </w:r>
-    </w:p>
-    <w:p>
-      <w:pPr>
-        <w:keepNext/>
-        <w:pBdr>
-          <w:bottom w:val="single" w:sz="6" w:space="2" w:color="1F3864"/>
-        </w:pBdr>
-        <w:spacing w:before="280" w:after="120"/>
+        <w:t xml:space="preserve">What we will do</w:t>
+      </w:r>
+    </w:p>
+    <w:p>
+      <w:pPr>
+        <w:spacing w:before="0" w:after="120" w:line="264" w:lineRule="auto"/>
+      </w:pPr>
+      <w:r>
+        <w:rPr>
+          <w:rFonts w:ascii="Calibri" w:eastAsia="Calibri" w:hAnsi="Calibri" w:cs="Calibri"/>
+          <w:color w:val="000000"/>
+          <w:sz w:val="22"/>
+          <w:szCs w:val="22"/>
+        </w:rPr>
+        <w:t xml:space="preserve">Once we have the VPN details, we will set it up on our machine, check that we can reach 192.168.80.30, confirm that the RTSP stream plays, and then connect the stream to the attendance system.</w:t>
+      </w:r>
+    </w:p>
+    <w:p>
+      <w:pPr>
+        <w:spacing w:before="0" w:after="120" w:line="264" w:lineRule="auto"/>
+      </w:pPr>
+      <w:r>
+        <w:rPr>
+          <w:rFonts w:ascii="Calibri" w:eastAsia="Calibri" w:hAnsi="Calibri" w:cs="Calibri"/>
+          <w:color w:val="000000"/>
+          <w:sz w:val="22"/>
+          <w:szCs w:val="22"/>
+        </w:rPr>
+        <w:t xml:space="preserve">Could you please tell us the Fortinet model and the VPN options available on it, and let us know a convenient time to do the setup and testing together? We are happy to work around your schedule.</w:t>
+      </w:r>
+    </w:p>
+    <w:p>
+      <w:pPr>
+        <w:spacing w:before="60" w:after="240" w:line="264" w:lineRule="auto"/>
+      </w:pPr>
+      <w:r>
+        <w:rPr>
+          <w:rFonts w:ascii="Calibri" w:eastAsia="Calibri" w:hAnsi="Calibri" w:cs="Calibri"/>
+          <w:color w:val="000000"/>
+          <w:sz w:val="22"/>
+          <w:szCs w:val="22"/>
+        </w:rPr>
+        <w:t xml:space="preserve">Thank you for your help.</w:t>
+      </w:r>
+    </w:p>
+    <w:p>
+      <w:pPr>
+        <w:spacing w:before="0" w:after="0" w:line="264" w:lineRule="auto"/>
+      </w:pPr>
+      <w:r>
+        <w:rPr>
+          <w:rFonts w:ascii="Calibri" w:eastAsia="Calibri" w:hAnsi="Calibri" w:cs="Calibri"/>
+          <w:color w:val="000000"/>
+          <w:sz w:val="22"/>
+          <w:szCs w:val="22"/>
+        </w:rPr>
+        <w:t xml:space="preserve">Regards,</w:t>
+      </w:r>
+    </w:p>
+    <w:p>
+      <w:pPr>
+        <w:spacing w:before="0" w:after="0" w:line="264" w:lineRule="auto"/>
       </w:pPr>
       <w:r>
         <w:rPr>
           <w:rFonts w:ascii="Calibri" w:eastAsia="Calibri" w:hAnsi="Calibri" w:cs="Calibri"/>
           <w:b/>
-          <w:color w:val="1F3864"/>
-          <w:sz w:val="26"/>
-          <w:szCs w:val="26"/>
-        </w:rPr>
-        <w:t xml:space="preserve">5. Orvantia Responsibilities</w:t>
-      </w:r>
-    </w:p>
-    <w:p>
-      <w:pPr>
-        <w:keepNext/>
-        <w:spacing w:before="0" w:after="120" w:line="264" w:lineRule="auto"/>
-      </w:pPr>
-      <w:r>
-        <w:rPr>
-          <w:rFonts w:ascii="Calibri" w:eastAsia="Calibri" w:hAnsi="Calibri" w:cs="Calibri"/>
-          <w:color w:val="000000"/>
-          <w:sz w:val="22"/>
-          <w:szCs w:val="22"/>
-        </w:rPr>
-        <w:t xml:space="preserve">After receiving the VPN configuration, Orvantia will:</w:t>
-      </w:r>
-    </w:p>
-    <w:p>
-      <w:pPr>
-        <w:numPr>
-          <w:ilvl w:val="0"/>
-          <w:numId w:val="11"/>
-        </w:numPr>
-        <w:spacing w:after="80" w:line="264" w:lineRule="auto"/>
-      </w:pPr>
-      <w:r>
-        <w:rPr>
-          <w:rFonts w:ascii="Calibri" w:eastAsia="Calibri" w:hAnsi="Calibri" w:cs="Calibri"/>
-          <w:color w:val="000000"/>
-          <w:sz w:val="22"/>
-          <w:szCs w:val="22"/>
-        </w:rPr>
-        <w:t xml:space="preserve">Configure the VPN on the designated remote machine.</w:t>
-      </w:r>
-    </w:p>
-    <w:p>
-      <w:pPr>
-        <w:numPr>
-          <w:ilvl w:val="0"/>
-          <w:numId w:val="11"/>
-        </w:numPr>
-        <w:spacing w:after="80" w:line="264" w:lineRule="auto"/>
-      </w:pPr>
-      <w:r>
-        <w:rPr>
-          <w:rFonts w:ascii="Calibri" w:eastAsia="Calibri" w:hAnsi="Calibri" w:cs="Calibri"/>
-          <w:color w:val="000000"/>
-          <w:sz w:val="22"/>
-          <w:szCs w:val="22"/>
-        </w:rPr>
-        <w:t xml:space="preserve">Establish and verify the VPN connection.</w:t>
-      </w:r>
-    </w:p>
-    <w:p>
-      <w:pPr>
-        <w:numPr>
-          <w:ilvl w:val="0"/>
-          <w:numId w:val="11"/>
-        </w:numPr>
-        <w:spacing w:after="80" w:line="264" w:lineRule="auto"/>
-      </w:pPr>
-      <w:r>
-        <w:rPr>
-          <w:rFonts w:ascii="Calibri" w:eastAsia="Calibri" w:hAnsi="Calibri" w:cs="Calibri"/>
-          <w:color w:val="000000"/>
-          <w:sz w:val="22"/>
-          <w:szCs w:val="22"/>
-        </w:rPr>
-        <w:t xml:space="preserve">Test connectivity to 192.168.80.30.</w:t>
-      </w:r>
-    </w:p>
-    <w:p>
-      <w:pPr>
-        <w:numPr>
-          <w:ilvl w:val="0"/>
-          <w:numId w:val="11"/>
-        </w:numPr>
-        <w:spacing w:after="80" w:line="264" w:lineRule="auto"/>
-      </w:pPr>
-      <w:r>
-        <w:rPr>
-          <w:rFonts w:ascii="Calibri" w:eastAsia="Calibri" w:hAnsi="Calibri" w:cs="Calibri"/>
-          <w:color w:val="000000"/>
-          <w:sz w:val="22"/>
-          <w:szCs w:val="22"/>
-        </w:rPr>
-        <w:t xml:space="preserve">Verify RTSP connectivity.</w:t>
-      </w:r>
-    </w:p>
-    <w:p>
-      <w:pPr>
-        <w:numPr>
-          <w:ilvl w:val="0"/>
-          <w:numId w:val="11"/>
-        </w:numPr>
-        <w:spacing w:after="80" w:line="264" w:lineRule="auto"/>
-      </w:pPr>
-      <w:r>
-        <w:rPr>
-          <w:rFonts w:ascii="Calibri" w:eastAsia="Calibri" w:hAnsi="Calibri" w:cs="Calibri"/>
-          <w:color w:val="000000"/>
-          <w:sz w:val="22"/>
-          <w:szCs w:val="22"/>
-        </w:rPr>
-        <w:t xml:space="preserve">Validate the camera stream.</w:t>
-      </w:r>
-    </w:p>
-    <w:p>
-      <w:pPr>
-        <w:numPr>
-          <w:ilvl w:val="0"/>
-          <w:numId w:val="11"/>
-        </w:numPr>
-        <w:spacing w:after="80" w:line="264" w:lineRule="auto"/>
-      </w:pPr>
-      <w:r>
-        <w:rPr>
-          <w:rFonts w:ascii="Calibri" w:eastAsia="Calibri" w:hAnsi="Calibri" w:cs="Calibri"/>
-          <w:color w:val="000000"/>
-          <w:sz w:val="22"/>
-          <w:szCs w:val="22"/>
-        </w:rPr>
-        <w:t xml:space="preserve">Integrate the camera stream with the AI-Based Attendance Tracking System.</w:t>
-      </w:r>
-    </w:p>
-    <w:p>
-      <w:pPr>
-        <w:keepNext/>
-        <w:pBdr>
-          <w:bottom w:val="single" w:sz="6" w:space="2" w:color="1F3864"/>
-        </w:pBdr>
-        <w:spacing w:before="280" w:after="120"/>
-      </w:pPr>
-      <w:r>
-        <w:rPr>
-          <w:rFonts w:ascii="Calibri" w:eastAsia="Calibri" w:hAnsi="Calibri" w:cs="Calibri"/>
-          <w:b/>
-          <w:color w:val="1F3864"/>
-          <w:sz w:val="26"/>
-          <w:szCs w:val="26"/>
-        </w:rPr>
-        <w:t xml:space="preserve">6. Expected Result</w:t>
-      </w:r>
-    </w:p>
-    <w:p>
-      <w:pPr>
-        <w:keepNext/>
-        <w:spacing w:before="0" w:after="120" w:line="264" w:lineRule="auto"/>
-      </w:pPr>
-      <w:r>
-        <w:rPr>
-          <w:rFonts w:ascii="Calibri" w:eastAsia="Calibri" w:hAnsi="Calibri" w:cs="Calibri"/>
-          <w:color w:val="000000"/>
-          <w:sz w:val="22"/>
-          <w:szCs w:val="22"/>
-        </w:rPr>
-        <w:t xml:space="preserve">Once configured, the Orvantia remote machine should be able to securely access the following endpoint through the VPN and use the camera stream for the Attendance Tracking System:</w:t>
-      </w:r>
-    </w:p>
-    <w:p>
-      <w:pPr>
-        <w:keepNext/>
-        <w:shd w:val="clear" w:color="auto" w:fill="F2F2F2"/>
-        <w:spacing w:after="0" w:line="240" w:lineRule="auto"/>
-        <w:ind w:left="567"/>
-      </w:pPr>
-      <w:r>
-        <w:rPr>
-          <w:rFonts w:ascii="Consolas" w:hAnsi="Consolas" w:cs="Consolas"/>
-          <w:color w:val="000000"/>
-          <w:sz w:val="19"/>
-          <w:szCs w:val="19"/>
-        </w:rPr>
-        <w:t xml:space="preserve">192.168.80.30:554</w:t>
-      </w:r>
-    </w:p>
-    <w:p>
-      <w:pPr>
-        <w:spacing w:after="60"/>
-      </w:pPr>
-    </w:p>
-    <w:p>
-      <w:pPr>
-        <w:keepNext/>
-        <w:pBdr>
-          <w:bottom w:val="single" w:sz="6" w:space="2" w:color="1F3864"/>
-        </w:pBdr>
-        <w:spacing w:before="280" w:after="120"/>
-      </w:pPr>
-      <w:r>
-        <w:rPr>
-          <w:rFonts w:ascii="Calibri" w:eastAsia="Calibri" w:hAnsi="Calibri" w:cs="Calibri"/>
-          <w:b/>
-          <w:color w:val="1F3864"/>
-          <w:sz w:val="26"/>
-          <w:szCs w:val="26"/>
-        </w:rPr>
-        <w:t xml:space="preserve">7. Next Step</w:t>
-      </w:r>
-    </w:p>
-    <w:p>
-      <w:pPr>
-        <w:spacing w:before="0" w:after="120" w:line="264" w:lineRule="auto"/>
-      </w:pPr>
-      <w:r>
-        <w:rPr>
-          <w:rFonts w:ascii="Calibri" w:eastAsia="Calibri" w:hAnsi="Calibri" w:cs="Calibri"/>
-          <w:color w:val="000000"/>
-          <w:sz w:val="22"/>
-          <w:szCs w:val="22"/>
-        </w:rPr>
-        <w:t xml:space="preserve">We request the client’s IT team to confirm the </w:t>
-      </w:r>
-      <w:r>
-        <w:rPr>
-          <w:rFonts w:ascii="Calibri" w:eastAsia="Calibri" w:hAnsi="Calibri" w:cs="Calibri"/>
-          <w:b/>
-          <w:color w:val="000000"/>
-          <w:sz w:val="22"/>
-          <w:szCs w:val="22"/>
-        </w:rPr>
-        <w:t xml:space="preserve">Fortinet model and available VPN configuration</w:t>
-      </w:r>
-      <w:r>
-        <w:rPr>
-          <w:rFonts w:ascii="Calibri" w:eastAsia="Calibri" w:hAnsi="Calibri" w:cs="Calibri"/>
-          <w:color w:val="000000"/>
-          <w:sz w:val="22"/>
-          <w:szCs w:val="22"/>
-        </w:rPr>
-        <w:t xml:space="preserve"> and coordinate with Orvantia for the VPN setup and connectivity testing.</w:t>
-      </w:r>
-    </w:p>
-    <w:p>
-      <w:pPr>
-        <w:spacing w:before="120" w:after="360" w:line="264" w:lineRule="auto"/>
-      </w:pPr>
-      <w:r>
-        <w:rPr>
-          <w:rFonts w:ascii="Calibri" w:eastAsia="Calibri" w:hAnsi="Calibri" w:cs="Calibri"/>
-          <w:color w:val="000000"/>
-          <w:sz w:val="22"/>
-          <w:szCs w:val="22"/>
-        </w:rPr>
-        <w:t xml:space="preserve">Thank you for your support. We look forward to your confirmation.</w:t>
+          <w:color w:val="000000"/>
+          <w:sz w:val="22"/>
+          <w:szCs w:val="22"/>
+        </w:rPr>
+        <w:t xml:space="preserve">Orvantia</w:t>
       </w:r>
     </w:p>
     <w:p>
@@ -1628,27 +778,11 @@
       <w:r>
         <w:rPr>
           <w:rFonts w:ascii="Calibri" w:eastAsia="Calibri" w:hAnsi="Calibri" w:cs="Calibri"/>
-          <w:b/>
-          <w:color w:val="000000"/>
-          <w:sz w:val="24"/>
-          <w:szCs w:val="24"/>
-        </w:rPr>
-        <w:t xml:space="preserve">ORVANTIA</w:t>
-      </w:r>
-    </w:p>
-    <w:p>
-      <w:pPr>
-        <w:spacing w:before="0" w:after="120" w:line="264" w:lineRule="auto"/>
-      </w:pPr>
-      <w:r>
-        <w:rPr>
-          <w:rFonts w:ascii="Calibri" w:eastAsia="Calibri" w:hAnsi="Calibri" w:cs="Calibri"/>
-          <w:i/>
-          <w:color w:val="595959"/>
-          <w:sz w:val="22"/>
-          <w:szCs w:val="22"/>
-        </w:rPr>
-        <w:t xml:space="preserve">Software Engineering &amp; AI Systems</w:t>
+          <w:color w:val="000000"/>
+          <w:sz w:val="22"/>
+          <w:szCs w:val="22"/>
+        </w:rPr>
+        <w:t xml:space="preserve">Software Development | AI Solutions</w:t>
       </w:r>
     </w:p>
     <w:sectPr>

</xml_diff>

<commit_message>
Replace connectivity diagram with plain explanation
Co-Authored-By: Claude Sonnet 5.5 <noreply@anthropic.com>
Claude-Session: https://claude.ai/code/session_01MMJ81NuDiSQSdUBaGVeEoa
</commit_message>
<xml_diff>
--- a/Orvantia_VPN_Access_Proposal.docx
+++ b/Orvantia_VPN_Access_Proposal.docx
@@ -241,7 +241,124 @@
           <w:sz w:val="22"/>
           <w:szCs w:val="22"/>
         </w:rPr>
-        <w:t xml:space="preserve">To avoid this, we would like to request a VPN connection to the NVR through your existing Fortinet firewall. The NVR would stay on your private network and would not be exposed to the internet; our machine would connect through the encrypted VPN and reach the NVR by its private IP address.</w:t>
+        <w:t xml:space="preserve">To avoid this, we would like to request a VPN connection to the NVR through your existing Fortinet firewall.</w:t>
+      </w:r>
+    </w:p>
+    <w:p>
+      <w:pPr>
+        <w:keepNext/>
+        <w:spacing w:before="160" w:after="80" w:line="264" w:lineRule="auto"/>
+      </w:pPr>
+      <w:r>
+        <w:rPr>
+          <w:rFonts w:ascii="Calibri" w:eastAsia="Calibri" w:hAnsi="Calibri" w:cs="Calibri"/>
+          <w:b/>
+          <w:color w:val="000000"/>
+          <w:sz w:val="22"/>
+          <w:szCs w:val="22"/>
+        </w:rPr>
+        <w:t xml:space="preserve">How the connection will work</w:t>
+      </w:r>
+    </w:p>
+    <w:p>
+      <w:pPr>
+        <w:keepNext/>
+        <w:spacing w:before="0" w:after="120" w:line="264" w:lineRule="auto"/>
+      </w:pPr>
+      <w:r>
+        <w:rPr>
+          <w:rFonts w:ascii="Calibri" w:eastAsia="Calibri" w:hAnsi="Calibri" w:cs="Calibri"/>
+          <w:color w:val="000000"/>
+          <w:sz w:val="22"/>
+          <w:szCs w:val="22"/>
+        </w:rPr>
+        <w:t xml:space="preserve">The NVR is on your factory network at 192.168.80.30, behind the Fortinet firewall (192.168.80.1). We do not want to open the NVR to the internet or forward any port to it. Instead, the connection will work like this:</w:t>
+      </w:r>
+    </w:p>
+    <w:p>
+      <w:pPr>
+        <w:numPr>
+          <w:ilvl w:val="0"/>
+          <w:numId w:val="12"/>
+        </w:numPr>
+        <w:spacing w:after="80" w:line="264" w:lineRule="auto"/>
+      </w:pPr>
+      <w:r>
+        <w:rPr>
+          <w:rFonts w:ascii="Calibri" w:eastAsia="Calibri" w:hAnsi="Calibri" w:cs="Calibri"/>
+          <w:color w:val="000000"/>
+          <w:sz w:val="22"/>
+          <w:szCs w:val="22"/>
+        </w:rPr>
+        <w:t xml:space="preserve">Our machine, which is outside your network, connects to your Fortinet firewall over the internet using the VPN login that you create for us. Everything between our machine and the firewall is encrypted.</w:t>
+      </w:r>
+    </w:p>
+    <w:p>
+      <w:pPr>
+        <w:numPr>
+          <w:ilvl w:val="0"/>
+          <w:numId w:val="12"/>
+        </w:numPr>
+        <w:spacing w:after="80" w:line="264" w:lineRule="auto"/>
+      </w:pPr>
+      <w:r>
+        <w:rPr>
+          <w:rFonts w:ascii="Calibri" w:eastAsia="Calibri" w:hAnsi="Calibri" w:cs="Calibri"/>
+          <w:color w:val="000000"/>
+          <w:sz w:val="22"/>
+          <w:szCs w:val="22"/>
+        </w:rPr>
+        <w:t xml:space="preserve">Once the VPN is up, the firewall treats our machine as if it were a device inside the 192.168.80.0/24 network, but only for the access you permit.</w:t>
+      </w:r>
+    </w:p>
+    <w:p>
+      <w:pPr>
+        <w:numPr>
+          <w:ilvl w:val="0"/>
+          <w:numId w:val="12"/>
+        </w:numPr>
+        <w:spacing w:after="80" w:line="264" w:lineRule="auto"/>
+      </w:pPr>
+      <w:r>
+        <w:rPr>
+          <w:rFonts w:ascii="Calibri" w:eastAsia="Calibri" w:hAnsi="Calibri" w:cs="Calibri"/>
+          <w:color w:val="000000"/>
+          <w:sz w:val="22"/>
+          <w:szCs w:val="22"/>
+        </w:rPr>
+        <w:t xml:space="preserve">Through the VPN, our machine opens the NVR at 192.168.80.30 on TCP port 554 and reads the camera stream (RTSP). Nothing else on your network needs to be reachable.</w:t>
+      </w:r>
+    </w:p>
+    <w:p>
+      <w:pPr>
+        <w:numPr>
+          <w:ilvl w:val="0"/>
+          <w:numId w:val="12"/>
+        </w:numPr>
+        <w:spacing w:after="80" w:line="264" w:lineRule="auto"/>
+      </w:pPr>
+      <w:r>
+        <w:rPr>
+          <w:rFonts w:ascii="Calibri" w:eastAsia="Calibri" w:hAnsi="Calibri" w:cs="Calibri"/>
+          <w:color w:val="000000"/>
+          <w:sz w:val="22"/>
+          <w:szCs w:val="22"/>
+        </w:rPr>
+        <w:t xml:space="preserve">The attendance software on our machine uses this stream. When we disconnect the VPN, the access stops.</w:t>
+      </w:r>
+    </w:p>
+    <w:p>
+      <w:pPr>
+        <w:spacing w:before="80" w:after="120" w:line="264" w:lineRule="auto"/>
+      </w:pPr>
+      <w:r>
+        <w:rPr>
+          <w:rFonts w:ascii="Calibri" w:eastAsia="Calibri" w:hAnsi="Calibri" w:cs="Calibri"/>
+          <w:color w:val="000000"/>
+          <w:sz w:val="22"/>
+          <w:szCs w:val="22"/>
+        </w:rPr>
+        <w:t xml:space="preserve">In short, the NVR remains private inside your network, and only our VPN user is allowed to reach it, only on the port that we need.</w:t>
       </w:r>
     </w:p>
     <w:p>
@@ -584,7 +701,7 @@
       <w:pPr>
         <w:numPr>
           <w:ilvl w:val="0"/>
-          <w:numId w:val="12"/>
+          <w:numId w:val="13"/>
         </w:numPr>
         <w:spacing w:after="80" w:line="264" w:lineRule="auto"/>
       </w:pPr>
@@ -602,7 +719,7 @@
       <w:pPr>
         <w:numPr>
           <w:ilvl w:val="0"/>
-          <w:numId w:val="12"/>
+          <w:numId w:val="13"/>
         </w:numPr>
         <w:spacing w:after="80" w:line="264" w:lineRule="auto"/>
       </w:pPr>
@@ -620,7 +737,7 @@
       <w:pPr>
         <w:numPr>
           <w:ilvl w:val="0"/>
-          <w:numId w:val="12"/>
+          <w:numId w:val="13"/>
         </w:numPr>
         <w:spacing w:after="80" w:line="264" w:lineRule="auto"/>
       </w:pPr>
@@ -638,7 +755,7 @@
       <w:pPr>
         <w:numPr>
           <w:ilvl w:val="0"/>
-          <w:numId w:val="12"/>
+          <w:numId w:val="13"/>
         </w:numPr>
         <w:spacing w:after="80" w:line="264" w:lineRule="auto"/>
       </w:pPr>
@@ -656,7 +773,7 @@
       <w:pPr>
         <w:numPr>
           <w:ilvl w:val="0"/>
-          <w:numId w:val="12"/>
+          <w:numId w:val="13"/>
         </w:numPr>
         <w:spacing w:after="80" w:line="264" w:lineRule="auto"/>
       </w:pPr>
@@ -1013,6 +1130,12 @@
   </w:num>
   <w:num w:numId="12">
     <w:abstractNumId w:val="11"/>
+  </w:num>
+  <w:num w:numId="13">
+    <w:abstractNumId w:val="11"/>
+    <w:lvlOverride w:ilvl="0">
+      <w:startOverride w:val="1"/>
+    </w:lvlOverride>
   </w:num>
 </w:numbering>
 </file>

</xml_diff>

<commit_message>
Remove Fortinet references from proposal
Co-Authored-By: Claude Sonnet 5.5 <noreply@anthropic.com>
Claude-Session: https://claude.ai/code/session_01MMJ81NuDiSQSdUBaGVeEoa
</commit_message>
<xml_diff>
--- a/Orvantia_VPN_Access_Proposal.docx
+++ b/Orvantia_VPN_Access_Proposal.docx
@@ -241,7 +241,7 @@
           <w:sz w:val="22"/>
           <w:szCs w:val="22"/>
         </w:rPr>
-        <w:t xml:space="preserve">To avoid this, we would like to request a VPN connection to the NVR through your existing Fortinet firewall.</w:t>
+        <w:t xml:space="preserve">To avoid this, we would like to request a VPN connection to the NVR through the firewall/gateway on your network.</w:t>
       </w:r>
     </w:p>
     <w:p>
@@ -272,7 +272,7 @@
           <w:sz w:val="22"/>
           <w:szCs w:val="22"/>
         </w:rPr>
-        <w:t xml:space="preserve">The NVR is on your factory network at 192.168.80.30, behind the Fortinet firewall (192.168.80.1). We do not want to open the NVR to the internet or forward any port to it. Instead, the connection will work like this:</w:t>
+        <w:t xml:space="preserve">The NVR is on your factory network at 192.168.80.30, behind your firewall/gateway (192.168.80.1). We do not want to open the NVR to the internet or forward any port to it. Instead, the connection will work like this:</w:t>
       </w:r>
     </w:p>
     <w:p>
@@ -290,7 +290,7 @@
           <w:sz w:val="22"/>
           <w:szCs w:val="22"/>
         </w:rPr>
-        <w:t xml:space="preserve">Our machine, which is outside your network, connects to your Fortinet firewall over the internet using the VPN login that you create for us. Everything between our machine and the firewall is encrypted.</w:t>
+        <w:t xml:space="preserve">Our machine, which is outside your network, connects to your firewall over the internet using the VPN login that you create for us. Everything between our machine and the firewall is encrypted.</w:t>
       </w:r>
     </w:p>
     <w:p>
@@ -712,7 +712,7 @@
           <w:sz w:val="22"/>
           <w:szCs w:val="22"/>
         </w:rPr>
-        <w:t xml:space="preserve">Set up a remote-access VPN on the Fortinet firewall, if one is not already available.</w:t>
+        <w:t xml:space="preserve">Set up a remote-access VPN on your firewall/gateway, if one is not already available.</w:t>
       </w:r>
     </w:p>
     <w:p>
@@ -842,7 +842,7 @@
           <w:sz w:val="22"/>
           <w:szCs w:val="22"/>
         </w:rPr>
-        <w:t xml:space="preserve">Could you please tell us the Fortinet model and the VPN options available on it, and let us know a convenient time to do the setup and testing together? We are happy to work around your schedule.</w:t>
+        <w:t xml:space="preserve">Could you please tell us which firewall/gateway device you use and what VPN options are available on it, and let us know a convenient time to do the setup and testing together? We are happy to work around your schedule.</w:t>
       </w:r>
     </w:p>
     <w:p>

</xml_diff>